<commit_message>
- fix symbols seraching
</commit_message>
<xml_diff>
--- a/docs/paper/davasko-llm-wiki.docx
+++ b/docs/paper/davasko-llm-wiki.docx
@@ -96,7 +96,7 @@
         <w:rPr>
           <w:rFonts w:ascii="Times New Roman" w:hAnsi="Times New Roman" w:cs="Times New Roman" w:eastAsia="Times New Roman"/>
         </w:rPr>
-        <w:t>It is verified empirically whether a curated hybrid (symbolic and semantic) retrieval layer over a knowledge base outperforms a trivial lexical file search when grounding LLM agents. The system architecture is described in detail: a downward-dependent layer model that separates immutable source snapshots from derived curated pages with content-hash provenance; a hybrid retriever with a per-query adaptive threshold; and a deduplicated, machine-shared embedding model resolved through a system marker. On a deployed 162-document base with 15 labeled queries, recall@5, MRR and nDCG@5 are computed for the proposed engine and baselines. Semantic retrieval yields recall@5 0.633 and MRR 0.718 against 0.333 and 0.435 for the lexical baseline; structure-aware chunking exceeds the fixed-window one by 7.8% MRR; GPU embedding gives an eight-fold speed-up. The retrieval layer is justified by measurement.</w:t>
+        <w:t>It is verified empirically whether a curated hybrid (symbolic and semantic) retrieval layer over a knowledge base outperforms a trivial lexical file search when grounding LLM agents. The system architecture is described in detail: a downward-dependent layer model that separates immutable source snapshots from derived curated pages with content-hash provenance; a hybrid retriever with a per-query adaptive threshold; and a deduplicated, machine-shared embedding model resolved through a system marker. On a deployed 162-document base with 15 labeled queries, recall@5, MRR and nDCG@5 are computed for the proposed engine and baselines. Semantic retrieval yields recall@5 0.633 and MRR 0.718 against 0.333 and 0.435 for the lexical baseline; structure-aware chunking exceeds the fixed-window one by 7.8% MRR; GPU embedding gives an eight-fold speed-up. A stress test across three query regimes (meaning, topic, exact identifier) additionally exposed and corrected a non-functional symbolic stream, doubling exact-identifier retrieval. The retrieval layer is justified by measurement.</w:t>
       </w:r>
     </w:p>
     <w:p>
@@ -2968,6 +2968,795 @@
     <w:p>
       <w:pPr>
         <w:keepNext/>
+        <w:spacing w:before="200" w:after="80"/>
+        <w:jc w:val="left"/>
+      </w:pPr>
+      <w:r>
+        <w:rPr>
+          <w:rFonts w:ascii="Times New Roman" w:hAnsi="Times New Roman" w:cs="Times New Roman" w:eastAsia="Times New Roman"/>
+          <w:b/>
+          <w:sz w:val="24"/>
+        </w:rPr>
+        <w:t>4.4 Stress test and reviving the symbolic stream</w:t>
+      </w:r>
+    </w:p>
+    <w:p>
+      <w:pPr>
+        <w:spacing w:before="0" w:after="0"/>
+        <w:ind w:firstLine="397"/>
+        <w:jc w:val="both"/>
+      </w:pPr>
+      <w:r>
+        <w:rPr>
+          <w:rFonts w:ascii="Times New Roman" w:hAnsi="Times New Roman" w:cs="Times New Roman" w:eastAsia="Times New Roman"/>
+        </w:rPr>
+        <w:t>Beyond the 15-query regression set, the engine was stress-tested on three larger query regimes constructed over the full 345-document deployment, each probing a different retrieval mode (Table 6): (R1) topic to document, where the query is a document's topic label (lexically easy); (R2) cross-lingual and paraphrased questions sharing no surface tokens with the target, where a lexical baseline cannot win by construction; and (R3) exact unique code identifiers (document frequency one), the best case for lexical search.</w:t>
+      </w:r>
+    </w:p>
+    <w:p>
+      <w:pPr>
+        <w:spacing w:before="0" w:after="0"/>
+        <w:ind w:firstLine="397"/>
+        <w:jc w:val="both"/>
+      </w:pPr>
+      <w:r>
+        <w:rPr>
+          <w:rFonts w:ascii="Times New Roman" w:hAnsi="Times New Roman" w:cs="Times New Roman" w:eastAsia="Times New Roman"/>
+        </w:rPr>
+        <w:t>The outcome splits sharply by regime. On meaning-bearing queries (R2) dense retrieval roughly tripled the lexical baseline (recall@5 0.684 against 0.237); on exact identifiers (R3) the lexical baseline dominated (0.990 against 0.286). R3 also exposed a defect: the hybrid equalled the semantic retriever exactly, i.e. the symbolic stream contributed nothing. The cause was that the indexer populated each document's symbols only from YAML frontmatter, leaving raw and code documents with empty symbol sets, so Stream A had nothing to match. The fix - automatic extraction of code identifiers (PascalCase, I-interfaces, m_-fields) from document content into the index - raised the share of documents with indexed symbols from 76 to 292 of 346 and, on R3, doubled hybrid recall@5 and raised MRR by about 150% with no regression on R1 or R2 (Table 7). The streams are thus complementary: dense retrieval owns meaning, the revived symbolic stream recovers exact-identifier lookup, and a verbatim file scan remains strongest for literal tokens. This is a further instance of the measurement-driven loop: a stress test revealed a silent failure that aggregate accuracy on the original set had hidden.</w:t>
+      </w:r>
+    </w:p>
+    <w:p>
+      <w:pPr>
+        <w:spacing w:before="120" w:after="40"/>
+        <w:jc w:val="left"/>
+      </w:pPr>
+      <w:r>
+        <w:rPr>
+          <w:rFonts w:ascii="Times New Roman" w:hAnsi="Times New Roman" w:cs="Times New Roman" w:eastAsia="Times New Roman"/>
+          <w:b/>
+          <w:color w:val="5B6573"/>
+          <w:sz w:val="21"/>
+        </w:rPr>
+        <w:t>Table 6 - Three-regime stress test, recall@5 (full 345-document corpus)</w:t>
+      </w:r>
+    </w:p>
+    <w:tbl>
+      <w:tblPr>
+        <w:tblStyle w:val="TableGrid"/>
+        <w:tblW w:type="auto" w:w="0"/>
+        <w:jc w:val="center"/>
+        <w:tblLook w:firstColumn="1" w:firstRow="1" w:lastColumn="0" w:lastRow="0" w:noHBand="0" w:noVBand="1" w:val="04A0"/>
+      </w:tblPr>
+      <w:tblGrid>
+        <w:gridCol w:w="1814"/>
+        <w:gridCol w:w="1814"/>
+        <w:gridCol w:w="1814"/>
+        <w:gridCol w:w="1814"/>
+        <w:gridCol w:w="1814"/>
+      </w:tblGrid>
+      <w:tr>
+        <w:tc>
+          <w:tcPr>
+            <w:tcW w:type="dxa" w:w="1814"/>
+            <w:shd w:val="clear" w:fill="EDEFF2"/>
+          </w:tcPr>
+          <w:p>
+            <w:pPr>
+              <w:spacing w:line="240" w:lineRule="auto" w:after="0"/>
+              <w:jc w:val="left"/>
+            </w:pPr>
+            <w:r/>
+            <w:r>
+              <w:rPr>
+                <w:rFonts w:ascii="Times New Roman" w:hAnsi="Times New Roman" w:cs="Times New Roman" w:eastAsia="Times New Roman"/>
+                <w:b/>
+                <w:sz w:val="21"/>
+              </w:rPr>
+              <w:t>Query regime</w:t>
+            </w:r>
+          </w:p>
+        </w:tc>
+        <w:tc>
+          <w:tcPr>
+            <w:tcW w:type="dxa" w:w="1814"/>
+            <w:shd w:val="clear" w:fill="EDEFF2"/>
+          </w:tcPr>
+          <w:p>
+            <w:pPr>
+              <w:spacing w:line="240" w:lineRule="auto" w:after="0"/>
+              <w:jc w:val="right"/>
+            </w:pPr>
+            <w:r/>
+            <w:r>
+              <w:rPr>
+                <w:rFonts w:ascii="Times New Roman" w:hAnsi="Times New Roman" w:cs="Times New Roman" w:eastAsia="Times New Roman"/>
+                <w:b/>
+                <w:sz w:val="21"/>
+              </w:rPr>
+              <w:t>n</w:t>
+            </w:r>
+          </w:p>
+        </w:tc>
+        <w:tc>
+          <w:tcPr>
+            <w:tcW w:type="dxa" w:w="1814"/>
+            <w:shd w:val="clear" w:fill="EDEFF2"/>
+          </w:tcPr>
+          <w:p>
+            <w:pPr>
+              <w:spacing w:line="240" w:lineRule="auto" w:after="0"/>
+              <w:jc w:val="right"/>
+            </w:pPr>
+            <w:r/>
+            <w:r>
+              <w:rPr>
+                <w:rFonts w:ascii="Times New Roman" w:hAnsi="Times New Roman" w:cs="Times New Roman" w:eastAsia="Times New Roman"/>
+                <w:b/>
+                <w:sz w:val="21"/>
+              </w:rPr>
+              <w:t>hybrid</w:t>
+            </w:r>
+          </w:p>
+        </w:tc>
+        <w:tc>
+          <w:tcPr>
+            <w:tcW w:type="dxa" w:w="1814"/>
+            <w:shd w:val="clear" w:fill="EDEFF2"/>
+          </w:tcPr>
+          <w:p>
+            <w:pPr>
+              <w:spacing w:line="240" w:lineRule="auto" w:after="0"/>
+              <w:jc w:val="right"/>
+            </w:pPr>
+            <w:r/>
+            <w:r>
+              <w:rPr>
+                <w:rFonts w:ascii="Times New Roman" w:hAnsi="Times New Roman" w:cs="Times New Roman" w:eastAsia="Times New Roman"/>
+                <w:b/>
+                <w:sz w:val="21"/>
+              </w:rPr>
+              <w:t>semantic</w:t>
+            </w:r>
+          </w:p>
+        </w:tc>
+        <w:tc>
+          <w:tcPr>
+            <w:tcW w:type="dxa" w:w="1814"/>
+            <w:shd w:val="clear" w:fill="EDEFF2"/>
+          </w:tcPr>
+          <w:p>
+            <w:pPr>
+              <w:spacing w:line="240" w:lineRule="auto" w:after="0"/>
+              <w:jc w:val="right"/>
+            </w:pPr>
+            <w:r/>
+            <w:r>
+              <w:rPr>
+                <w:rFonts w:ascii="Times New Roman" w:hAnsi="Times New Roman" w:cs="Times New Roman" w:eastAsia="Times New Roman"/>
+                <w:b/>
+                <w:sz w:val="21"/>
+              </w:rPr>
+              <w:t>lexical</w:t>
+            </w:r>
+          </w:p>
+        </w:tc>
+      </w:tr>
+      <w:tr>
+        <w:tc>
+          <w:tcPr>
+            <w:tcW w:type="dxa" w:w="1814"/>
+            <w:shd w:val="clear" w:fill="EEFAF4"/>
+          </w:tcPr>
+          <w:p>
+            <w:pPr>
+              <w:spacing w:line="240" w:lineRule="auto" w:after="0"/>
+              <w:jc w:val="left"/>
+            </w:pPr>
+            <w:r/>
+            <w:r>
+              <w:rPr>
+                <w:rFonts w:ascii="Times New Roman" w:hAnsi="Times New Roman" w:cs="Times New Roman" w:eastAsia="Times New Roman"/>
+                <w:b/>
+                <w:sz w:val="21"/>
+              </w:rPr>
+              <w:t>R2 - cross-lingual / paraphrase (meaning)</w:t>
+            </w:r>
+          </w:p>
+        </w:tc>
+        <w:tc>
+          <w:tcPr>
+            <w:tcW w:type="dxa" w:w="1814"/>
+            <w:shd w:val="clear" w:fill="EEFAF4"/>
+          </w:tcPr>
+          <w:p>
+            <w:pPr>
+              <w:spacing w:line="240" w:lineRule="auto" w:after="0"/>
+              <w:jc w:val="right"/>
+            </w:pPr>
+            <w:r/>
+            <w:r>
+              <w:rPr>
+                <w:rFonts w:ascii="Times New Roman" w:hAnsi="Times New Roman" w:cs="Times New Roman" w:eastAsia="Times New Roman"/>
+                <w:sz w:val="21"/>
+              </w:rPr>
+              <w:t>38</w:t>
+            </w:r>
+          </w:p>
+        </w:tc>
+        <w:tc>
+          <w:tcPr>
+            <w:tcW w:type="dxa" w:w="1814"/>
+            <w:shd w:val="clear" w:fill="EEFAF4"/>
+          </w:tcPr>
+          <w:p>
+            <w:pPr>
+              <w:spacing w:line="240" w:lineRule="auto" w:after="0"/>
+              <w:jc w:val="right"/>
+            </w:pPr>
+            <w:r/>
+            <w:r>
+              <w:rPr>
+                <w:rFonts w:ascii="Times New Roman" w:hAnsi="Times New Roman" w:cs="Times New Roman" w:eastAsia="Times New Roman"/>
+                <w:sz w:val="21"/>
+              </w:rPr>
+              <w:t>0.684</w:t>
+            </w:r>
+          </w:p>
+        </w:tc>
+        <w:tc>
+          <w:tcPr>
+            <w:tcW w:type="dxa" w:w="1814"/>
+            <w:shd w:val="clear" w:fill="EEFAF4"/>
+          </w:tcPr>
+          <w:p>
+            <w:pPr>
+              <w:spacing w:line="240" w:lineRule="auto" w:after="0"/>
+              <w:jc w:val="right"/>
+            </w:pPr>
+            <w:r/>
+            <w:r>
+              <w:rPr>
+                <w:rFonts w:ascii="Times New Roman" w:hAnsi="Times New Roman" w:cs="Times New Roman" w:eastAsia="Times New Roman"/>
+                <w:sz w:val="21"/>
+              </w:rPr>
+              <w:t>0.684</w:t>
+            </w:r>
+          </w:p>
+        </w:tc>
+        <w:tc>
+          <w:tcPr>
+            <w:tcW w:type="dxa" w:w="1814"/>
+            <w:shd w:val="clear" w:fill="EEFAF4"/>
+          </w:tcPr>
+          <w:p>
+            <w:pPr>
+              <w:spacing w:line="240" w:lineRule="auto" w:after="0"/>
+              <w:jc w:val="right"/>
+            </w:pPr>
+            <w:r/>
+            <w:r>
+              <w:rPr>
+                <w:rFonts w:ascii="Times New Roman" w:hAnsi="Times New Roman" w:cs="Times New Roman" w:eastAsia="Times New Roman"/>
+                <w:sz w:val="21"/>
+              </w:rPr>
+              <w:t>0.237</w:t>
+            </w:r>
+          </w:p>
+        </w:tc>
+      </w:tr>
+      <w:tr>
+        <w:tc>
+          <w:tcPr>
+            <w:tcW w:type="dxa" w:w="1814"/>
+          </w:tcPr>
+          <w:p>
+            <w:pPr>
+              <w:spacing w:line="240" w:lineRule="auto" w:after="0"/>
+              <w:jc w:val="left"/>
+            </w:pPr>
+            <w:r/>
+            <w:r>
+              <w:rPr>
+                <w:rFonts w:ascii="Times New Roman" w:hAnsi="Times New Roman" w:cs="Times New Roman" w:eastAsia="Times New Roman"/>
+                <w:sz w:val="21"/>
+              </w:rPr>
+              <w:t>R1 - topic to document</w:t>
+            </w:r>
+          </w:p>
+        </w:tc>
+        <w:tc>
+          <w:tcPr>
+            <w:tcW w:type="dxa" w:w="1814"/>
+          </w:tcPr>
+          <w:p>
+            <w:pPr>
+              <w:spacing w:line="240" w:lineRule="auto" w:after="0"/>
+              <w:jc w:val="right"/>
+            </w:pPr>
+            <w:r/>
+            <w:r>
+              <w:rPr>
+                <w:rFonts w:ascii="Times New Roman" w:hAnsi="Times New Roman" w:cs="Times New Roman" w:eastAsia="Times New Roman"/>
+                <w:sz w:val="21"/>
+              </w:rPr>
+              <w:t>100</w:t>
+            </w:r>
+          </w:p>
+        </w:tc>
+        <w:tc>
+          <w:tcPr>
+            <w:tcW w:type="dxa" w:w="1814"/>
+          </w:tcPr>
+          <w:p>
+            <w:pPr>
+              <w:spacing w:line="240" w:lineRule="auto" w:after="0"/>
+              <w:jc w:val="right"/>
+            </w:pPr>
+            <w:r/>
+            <w:r>
+              <w:rPr>
+                <w:rFonts w:ascii="Times New Roman" w:hAnsi="Times New Roman" w:cs="Times New Roman" w:eastAsia="Times New Roman"/>
+                <w:sz w:val="21"/>
+              </w:rPr>
+              <w:t>0.929</w:t>
+            </w:r>
+          </w:p>
+        </w:tc>
+        <w:tc>
+          <w:tcPr>
+            <w:tcW w:type="dxa" w:w="1814"/>
+          </w:tcPr>
+          <w:p>
+            <w:pPr>
+              <w:spacing w:line="240" w:lineRule="auto" w:after="0"/>
+              <w:jc w:val="right"/>
+            </w:pPr>
+            <w:r/>
+            <w:r>
+              <w:rPr>
+                <w:rFonts w:ascii="Times New Roman" w:hAnsi="Times New Roman" w:cs="Times New Roman" w:eastAsia="Times New Roman"/>
+                <w:sz w:val="21"/>
+              </w:rPr>
+              <w:t>0.929</w:t>
+            </w:r>
+          </w:p>
+        </w:tc>
+        <w:tc>
+          <w:tcPr>
+            <w:tcW w:type="dxa" w:w="1814"/>
+          </w:tcPr>
+          <w:p>
+            <w:pPr>
+              <w:spacing w:line="240" w:lineRule="auto" w:after="0"/>
+              <w:jc w:val="right"/>
+            </w:pPr>
+            <w:r/>
+            <w:r>
+              <w:rPr>
+                <w:rFonts w:ascii="Times New Roman" w:hAnsi="Times New Roman" w:cs="Times New Roman" w:eastAsia="Times New Roman"/>
+                <w:sz w:val="21"/>
+              </w:rPr>
+              <w:t>0.838</w:t>
+            </w:r>
+          </w:p>
+        </w:tc>
+      </w:tr>
+      <w:tr>
+        <w:tc>
+          <w:tcPr>
+            <w:tcW w:type="dxa" w:w="1814"/>
+          </w:tcPr>
+          <w:p>
+            <w:pPr>
+              <w:spacing w:line="240" w:lineRule="auto" w:after="0"/>
+              <w:jc w:val="left"/>
+            </w:pPr>
+            <w:r/>
+            <w:r>
+              <w:rPr>
+                <w:rFonts w:ascii="Times New Roman" w:hAnsi="Times New Roman" w:cs="Times New Roman" w:eastAsia="Times New Roman"/>
+                <w:sz w:val="21"/>
+              </w:rPr>
+              <w:t>R3 - exact unique identifier (after fix)</w:t>
+            </w:r>
+          </w:p>
+        </w:tc>
+        <w:tc>
+          <w:tcPr>
+            <w:tcW w:type="dxa" w:w="1814"/>
+          </w:tcPr>
+          <w:p>
+            <w:pPr>
+              <w:spacing w:line="240" w:lineRule="auto" w:after="0"/>
+              <w:jc w:val="right"/>
+            </w:pPr>
+            <w:r/>
+            <w:r>
+              <w:rPr>
+                <w:rFonts w:ascii="Times New Roman" w:hAnsi="Times New Roman" w:cs="Times New Roman" w:eastAsia="Times New Roman"/>
+                <w:sz w:val="21"/>
+              </w:rPr>
+              <w:t>98</w:t>
+            </w:r>
+          </w:p>
+        </w:tc>
+        <w:tc>
+          <w:tcPr>
+            <w:tcW w:type="dxa" w:w="1814"/>
+          </w:tcPr>
+          <w:p>
+            <w:pPr>
+              <w:spacing w:line="240" w:lineRule="auto" w:after="0"/>
+              <w:jc w:val="right"/>
+            </w:pPr>
+            <w:r/>
+            <w:r>
+              <w:rPr>
+                <w:rFonts w:ascii="Times New Roman" w:hAnsi="Times New Roman" w:cs="Times New Roman" w:eastAsia="Times New Roman"/>
+                <w:sz w:val="21"/>
+              </w:rPr>
+              <w:t>0.576</w:t>
+            </w:r>
+          </w:p>
+        </w:tc>
+        <w:tc>
+          <w:tcPr>
+            <w:tcW w:type="dxa" w:w="1814"/>
+          </w:tcPr>
+          <w:p>
+            <w:pPr>
+              <w:spacing w:line="240" w:lineRule="auto" w:after="0"/>
+              <w:jc w:val="right"/>
+            </w:pPr>
+            <w:r/>
+            <w:r>
+              <w:rPr>
+                <w:rFonts w:ascii="Times New Roman" w:hAnsi="Times New Roman" w:cs="Times New Roman" w:eastAsia="Times New Roman"/>
+                <w:sz w:val="21"/>
+              </w:rPr>
+              <w:t>0.283</w:t>
+            </w:r>
+          </w:p>
+        </w:tc>
+        <w:tc>
+          <w:tcPr>
+            <w:tcW w:type="dxa" w:w="1814"/>
+          </w:tcPr>
+          <w:p>
+            <w:pPr>
+              <w:spacing w:line="240" w:lineRule="auto" w:after="0"/>
+              <w:jc w:val="right"/>
+            </w:pPr>
+            <w:r/>
+            <w:r>
+              <w:rPr>
+                <w:rFonts w:ascii="Times New Roman" w:hAnsi="Times New Roman" w:cs="Times New Roman" w:eastAsia="Times New Roman"/>
+                <w:sz w:val="21"/>
+              </w:rPr>
+              <w:t>0.990</w:t>
+            </w:r>
+          </w:p>
+        </w:tc>
+      </w:tr>
+    </w:tbl>
+    <w:p>
+      <w:pPr>
+        <w:spacing w:before="120" w:after="40"/>
+        <w:jc w:val="center"/>
+      </w:pPr>
+      <w:r>
+        <w:rPr>
+          <w:rFonts w:ascii="Times New Roman" w:hAnsi="Times New Roman" w:cs="Times New Roman" w:eastAsia="Times New Roman"/>
+          <w:color w:val="5B6573"/>
+          <w:sz w:val="21"/>
+        </w:rPr>
+        <w:t>Methods are complementary: the engine wins on meaning (R2), a verbatim scan wins on exact tokens (R3).</w:t>
+      </w:r>
+    </w:p>
+    <w:p>
+      <w:pPr>
+        <w:spacing w:after="40"/>
+      </w:pPr>
+    </w:p>
+    <w:p>
+      <w:pPr>
+        <w:spacing w:before="120" w:after="40"/>
+        <w:jc w:val="left"/>
+      </w:pPr>
+      <w:r>
+        <w:rPr>
+          <w:rFonts w:ascii="Times New Roman" w:hAnsi="Times New Roman" w:cs="Times New Roman" w:eastAsia="Times New Roman"/>
+          <w:b/>
+          <w:color w:val="5B6573"/>
+          <w:sz w:val="21"/>
+        </w:rPr>
+        <w:t>Table 7 - Reviving the symbolic stream (regime R3, exact identifiers)</w:t>
+      </w:r>
+    </w:p>
+    <w:tbl>
+      <w:tblPr>
+        <w:tblStyle w:val="TableGrid"/>
+        <w:tblW w:type="auto" w:w="0"/>
+        <w:jc w:val="center"/>
+        <w:tblLook w:firstColumn="1" w:firstRow="1" w:lastColumn="0" w:lastRow="0" w:noHBand="0" w:noVBand="1" w:val="04A0"/>
+      </w:tblPr>
+      <w:tblGrid>
+        <w:gridCol w:w="2268"/>
+        <w:gridCol w:w="2268"/>
+        <w:gridCol w:w="2268"/>
+        <w:gridCol w:w="2268"/>
+      </w:tblGrid>
+      <w:tr>
+        <w:tc>
+          <w:tcPr>
+            <w:tcW w:type="dxa" w:w="2268"/>
+            <w:shd w:val="clear" w:fill="EDEFF2"/>
+          </w:tcPr>
+          <w:p>
+            <w:pPr>
+              <w:spacing w:line="240" w:lineRule="auto" w:after="0"/>
+              <w:jc w:val="left"/>
+            </w:pPr>
+            <w:r/>
+            <w:r>
+              <w:rPr>
+                <w:rFonts w:ascii="Times New Roman" w:hAnsi="Times New Roman" w:cs="Times New Roman" w:eastAsia="Times New Roman"/>
+                <w:b/>
+                <w:sz w:val="21"/>
+              </w:rPr>
+              <w:t>Index symbol source</w:t>
+            </w:r>
+          </w:p>
+        </w:tc>
+        <w:tc>
+          <w:tcPr>
+            <w:tcW w:type="dxa" w:w="2268"/>
+            <w:shd w:val="clear" w:fill="EDEFF2"/>
+          </w:tcPr>
+          <w:p>
+            <w:pPr>
+              <w:spacing w:line="240" w:lineRule="auto" w:after="0"/>
+              <w:jc w:val="right"/>
+            </w:pPr>
+            <w:r/>
+            <w:r>
+              <w:rPr>
+                <w:rFonts w:ascii="Times New Roman" w:hAnsi="Times New Roman" w:cs="Times New Roman" w:eastAsia="Times New Roman"/>
+                <w:b/>
+                <w:sz w:val="21"/>
+              </w:rPr>
+              <w:t>docs with symbols</w:t>
+            </w:r>
+          </w:p>
+        </w:tc>
+        <w:tc>
+          <w:tcPr>
+            <w:tcW w:type="dxa" w:w="2268"/>
+            <w:shd w:val="clear" w:fill="EDEFF2"/>
+          </w:tcPr>
+          <w:p>
+            <w:pPr>
+              <w:spacing w:line="240" w:lineRule="auto" w:after="0"/>
+              <w:jc w:val="right"/>
+            </w:pPr>
+            <w:r/>
+            <w:r>
+              <w:rPr>
+                <w:rFonts w:ascii="Times New Roman" w:hAnsi="Times New Roman" w:cs="Times New Roman" w:eastAsia="Times New Roman"/>
+                <w:b/>
+                <w:sz w:val="21"/>
+              </w:rPr>
+              <w:t>hybrid recall@5</w:t>
+            </w:r>
+          </w:p>
+        </w:tc>
+        <w:tc>
+          <w:tcPr>
+            <w:tcW w:type="dxa" w:w="2268"/>
+            <w:shd w:val="clear" w:fill="EDEFF2"/>
+          </w:tcPr>
+          <w:p>
+            <w:pPr>
+              <w:spacing w:line="240" w:lineRule="auto" w:after="0"/>
+              <w:jc w:val="right"/>
+            </w:pPr>
+            <w:r/>
+            <w:r>
+              <w:rPr>
+                <w:rFonts w:ascii="Times New Roman" w:hAnsi="Times New Roman" w:cs="Times New Roman" w:eastAsia="Times New Roman"/>
+                <w:b/>
+                <w:sz w:val="21"/>
+              </w:rPr>
+              <w:t>hybrid MRR</w:t>
+            </w:r>
+          </w:p>
+        </w:tc>
+      </w:tr>
+      <w:tr>
+        <w:tc>
+          <w:tcPr>
+            <w:tcW w:type="dxa" w:w="2268"/>
+          </w:tcPr>
+          <w:p>
+            <w:pPr>
+              <w:spacing w:line="240" w:lineRule="auto" w:after="0"/>
+              <w:jc w:val="left"/>
+            </w:pPr>
+            <w:r/>
+            <w:r>
+              <w:rPr>
+                <w:rFonts w:ascii="Times New Roman" w:hAnsi="Times New Roman" w:cs="Times New Roman" w:eastAsia="Times New Roman"/>
+                <w:sz w:val="21"/>
+              </w:rPr>
+              <w:t>frontmatter only (before)</w:t>
+            </w:r>
+          </w:p>
+        </w:tc>
+        <w:tc>
+          <w:tcPr>
+            <w:tcW w:type="dxa" w:w="2268"/>
+          </w:tcPr>
+          <w:p>
+            <w:pPr>
+              <w:spacing w:line="240" w:lineRule="auto" w:after="0"/>
+              <w:jc w:val="right"/>
+            </w:pPr>
+            <w:r/>
+            <w:r>
+              <w:rPr>
+                <w:rFonts w:ascii="Times New Roman" w:hAnsi="Times New Roman" w:cs="Times New Roman" w:eastAsia="Times New Roman"/>
+                <w:sz w:val="21"/>
+              </w:rPr>
+              <w:t>76 / 346</w:t>
+            </w:r>
+          </w:p>
+        </w:tc>
+        <w:tc>
+          <w:tcPr>
+            <w:tcW w:type="dxa" w:w="2268"/>
+          </w:tcPr>
+          <w:p>
+            <w:pPr>
+              <w:spacing w:line="240" w:lineRule="auto" w:after="0"/>
+              <w:jc w:val="right"/>
+            </w:pPr>
+            <w:r/>
+            <w:r>
+              <w:rPr>
+                <w:rFonts w:ascii="Times New Roman" w:hAnsi="Times New Roman" w:cs="Times New Roman" w:eastAsia="Times New Roman"/>
+                <w:sz w:val="21"/>
+              </w:rPr>
+              <w:t>0.286</w:t>
+            </w:r>
+          </w:p>
+        </w:tc>
+        <w:tc>
+          <w:tcPr>
+            <w:tcW w:type="dxa" w:w="2268"/>
+          </w:tcPr>
+          <w:p>
+            <w:pPr>
+              <w:spacing w:line="240" w:lineRule="auto" w:after="0"/>
+              <w:jc w:val="right"/>
+            </w:pPr>
+            <w:r/>
+            <w:r>
+              <w:rPr>
+                <w:rFonts w:ascii="Times New Roman" w:hAnsi="Times New Roman" w:cs="Times New Roman" w:eastAsia="Times New Roman"/>
+                <w:sz w:val="21"/>
+              </w:rPr>
+              <w:t>0.227</w:t>
+            </w:r>
+          </w:p>
+        </w:tc>
+      </w:tr>
+      <w:tr>
+        <w:tc>
+          <w:tcPr>
+            <w:tcW w:type="dxa" w:w="2268"/>
+            <w:shd w:val="clear" w:fill="EEFAF4"/>
+          </w:tcPr>
+          <w:p>
+            <w:pPr>
+              <w:spacing w:line="240" w:lineRule="auto" w:after="0"/>
+              <w:jc w:val="left"/>
+            </w:pPr>
+            <w:r/>
+            <w:r>
+              <w:rPr>
+                <w:rFonts w:ascii="Times New Roman" w:hAnsi="Times New Roman" w:cs="Times New Roman" w:eastAsia="Times New Roman"/>
+                <w:b/>
+                <w:sz w:val="21"/>
+              </w:rPr>
+              <w:t>+ content auto-extraction (after)</w:t>
+            </w:r>
+          </w:p>
+        </w:tc>
+        <w:tc>
+          <w:tcPr>
+            <w:tcW w:type="dxa" w:w="2268"/>
+            <w:shd w:val="clear" w:fill="EEFAF4"/>
+          </w:tcPr>
+          <w:p>
+            <w:pPr>
+              <w:spacing w:line="240" w:lineRule="auto" w:after="0"/>
+              <w:jc w:val="right"/>
+            </w:pPr>
+            <w:r/>
+            <w:r>
+              <w:rPr>
+                <w:rFonts w:ascii="Times New Roman" w:hAnsi="Times New Roman" w:cs="Times New Roman" w:eastAsia="Times New Roman"/>
+                <w:sz w:val="21"/>
+              </w:rPr>
+              <w:t>292 / 346</w:t>
+            </w:r>
+          </w:p>
+        </w:tc>
+        <w:tc>
+          <w:tcPr>
+            <w:tcW w:type="dxa" w:w="2268"/>
+            <w:shd w:val="clear" w:fill="EEFAF4"/>
+          </w:tcPr>
+          <w:p>
+            <w:pPr>
+              <w:spacing w:line="240" w:lineRule="auto" w:after="0"/>
+              <w:jc w:val="right"/>
+            </w:pPr>
+            <w:r/>
+            <w:r>
+              <w:rPr>
+                <w:rFonts w:ascii="Times New Roman" w:hAnsi="Times New Roman" w:cs="Times New Roman" w:eastAsia="Times New Roman"/>
+                <w:sz w:val="21"/>
+              </w:rPr>
+              <w:t>0.576</w:t>
+            </w:r>
+          </w:p>
+        </w:tc>
+        <w:tc>
+          <w:tcPr>
+            <w:tcW w:type="dxa" w:w="2268"/>
+            <w:shd w:val="clear" w:fill="EEFAF4"/>
+          </w:tcPr>
+          <w:p>
+            <w:pPr>
+              <w:spacing w:line="240" w:lineRule="auto" w:after="0"/>
+              <w:jc w:val="right"/>
+            </w:pPr>
+            <w:r/>
+            <w:r>
+              <w:rPr>
+                <w:rFonts w:ascii="Times New Roman" w:hAnsi="Times New Roman" w:cs="Times New Roman" w:eastAsia="Times New Roman"/>
+                <w:sz w:val="21"/>
+              </w:rPr>
+              <w:t>0.567</w:t>
+            </w:r>
+          </w:p>
+        </w:tc>
+      </w:tr>
+    </w:tbl>
+    <w:p>
+      <w:pPr>
+        <w:spacing w:before="120" w:after="40"/>
+        <w:jc w:val="center"/>
+      </w:pPr>
+      <w:r>
+        <w:rPr>
+          <w:rFonts w:ascii="Times New Roman" w:hAnsi="Times New Roman" w:cs="Times New Roman" w:eastAsia="Times New Roman"/>
+          <w:color w:val="5B6573"/>
+          <w:sz w:val="21"/>
+        </w:rPr>
+        <w:t>Auto-extracting code identifiers doubles exact-identifier recall@5 (+101%) and MRR (+150%); semantic and lexical unchanged.</w:t>
+      </w:r>
+    </w:p>
+    <w:p>
+      <w:pPr>
+        <w:spacing w:after="40"/>
+      </w:pPr>
+    </w:p>
+    <w:p>
+      <w:pPr>
+        <w:keepNext/>
         <w:spacing w:before="240" w:after="80"/>
         <w:jc w:val="left"/>
       </w:pPr>
@@ -3129,7 +3918,7 @@
         <w:rPr>
           <w:rFonts w:ascii="Times New Roman" w:hAnsi="Times New Roman" w:cs="Times New Roman" w:eastAsia="Times New Roman"/>
         </w:rPr>
-        <w:t>In this work a layered, self-validating knowledge-base architecture is described in detail and an often-asserted assumption about the effectiveness of a dedicated retrieval layer is turned into a measured fact: on a real deployed knowledge base a layered hybrid retrieval engine substantially outperforms the lexical baseline (recall@5 0.633 against 0.333, MRR 0.718 against 0.435). A measurement-driven refinement loop is demonstrated: two ranking corrections (+12% MRR) and the choice of chunking strategy (+7.8% MRR) were adopted after confirmation by data, and the speed optimizations (eight-fold GPU speed-up, batching) were introduced after proven numerical equivalence. The architecture contributes a source-vs-derived split with content-hash provenance and a machine-shared, marker-resolved embedding model that eliminates per-base duplication. The limitations are documented and mapped to concrete directions for further experiments. All results are reproducible with the accompanying harness.</w:t>
+        <w:t>In this work a layered, self-validating knowledge-base architecture is described in detail and an often-asserted assumption about the effectiveness of a dedicated retrieval layer is turned into a measured fact: on a real deployed knowledge base a layered hybrid retrieval engine substantially outperforms the lexical baseline (recall@5 0.633 against 0.333, MRR 0.718 against 0.435). A measurement-driven refinement loop is demonstrated: two ranking corrections (+12% MRR) and the choice of chunking strategy (+7.8% MRR) were adopted after confirmation by data, and the speed optimizations (eight-fold GPU speed-up, batching) were introduced after proven numerical equivalence. A three-regime stress test extended the evaluation and exposed a silent failure (a symbolic stream left empty by frontmatter-only symbols) whose correction (content auto-extraction of code identifiers) doubled exact-identifier retrieval (hybrid recall@5 0.286 to 0.576, MRR 0.227 to 0.567) without regressing the other regimes. The architecture contributes a source-vs-derived split with content-hash provenance and a machine-shared, marker-resolved embedding model that eliminates per-base duplication. The limitations are documented and mapped to concrete directions for further experiments. All results are reproducible with the accompanying harness.</w:t>
       </w:r>
     </w:p>
     <w:p>

</xml_diff>